<commit_message>
chore: add project planning documentation for backend migration and UX improvements
</commit_message>
<xml_diff>
--- a/tests/Hermes的原理.docx
+++ b/tests/Hermes的原理.docx
@@ -4,6 +4,9 @@
   <w:body>
     <w:p>
       <w:pPr>
+        <w:pStyle w:val="2"/>
+        <w:bidi w:val="0"/>
+        <w:jc w:val="center"/>
         <w:rPr>
           <w:rFonts w:hint="eastAsia"/>
           <w:lang w:val="en-US" w:eastAsia="zh-CN"/>
@@ -12,50 +15,34 @@
       <w:r>
         <w:rPr>
           <w:rFonts w:hint="eastAsia"/>
-          <w:lang w:val="en-US" w:eastAsia="zh-CN"/>
-        </w:rPr>
-        <w:t xml:space="preserve">Hermes is amazing!  </w:t>
+          <w:b/>
+          <w:lang w:val="en-US" w:eastAsia="zh-CN"/>
+        </w:rPr>
+        <w:t>赫尔墨斯原理</w:t>
       </w:r>
     </w:p>
     <w:p>
       <w:pPr>
         <w:rPr>
-          <w:rFonts w:hint="default"/>
-          <w:lang w:val="en-US" w:eastAsia="zh-CN"/>
-        </w:rPr>
-      </w:pPr>
-    </w:p>
-    <w:p>
-      <w:pPr>
-        <w:rPr>
-          <w:rFonts w:hint="default"/>
-          <w:lang w:val="en-US" w:eastAsia="zh-CN"/>
-        </w:rPr>
-      </w:pPr>
-    </w:p>
-    <w:p>
-      <w:pPr>
-        <w:rPr>
-          <w:rFonts w:hint="default"/>
-          <w:lang w:val="en-US" w:eastAsia="zh-CN"/>
-        </w:rPr>
-      </w:pPr>
-    </w:p>
-    <w:p>
-      <w:pPr>
-        <w:rPr>
-          <w:rFonts w:hint="default"/>
-          <w:lang w:val="en-US" w:eastAsia="zh-CN"/>
-        </w:rPr>
-      </w:pPr>
-    </w:p>
-    <w:p>
-      <w:pPr>
-        <w:rPr>
-          <w:rFonts w:hint="default"/>
-          <w:lang w:val="en-US" w:eastAsia="zh-CN"/>
-        </w:rPr>
-      </w:pPr>
+          <w:rFonts w:hint="eastAsia"/>
+          <w:lang w:val="en-US" w:eastAsia="zh-CN"/>
+        </w:rPr>
+      </w:pPr>
+    </w:p>
+    <w:p>
+      <w:pPr>
+        <w:rPr>
+          <w:rFonts w:hint="eastAsia"/>
+          <w:lang w:val="en-US" w:eastAsia="zh-CN"/>
+        </w:rPr>
+      </w:pPr>
+      <w:r>
+        <w:rPr>
+          <w:rFonts w:hint="eastAsia"/>
+          <w:lang w:val="en-US" w:eastAsia="zh-CN"/>
+        </w:rPr>
+        <w:t>Hermes is amazing!</w:t>
+      </w:r>
     </w:p>
     <w:p>
       <w:pPr>
@@ -375,16 +362,8 @@
           <w:rFonts w:hint="eastAsia"/>
           <w:lang w:val="en-US" w:eastAsia="zh-CN"/>
         </w:rPr>
-        <w:t>I love you</w:t>
+        <w:t>Love, Death &amp; Robots</w:t>
       </w:r>
-    </w:p>
-    <w:p>
-      <w:pPr>
-        <w:rPr>
-          <w:rFonts w:hint="default"/>
-          <w:lang w:val="en-US" w:eastAsia="zh-CN"/>
-        </w:rPr>
-      </w:pPr>
     </w:p>
     <w:sectPr>
       <w:pgSz w:w="11906" w:h="16838"/>

</xml_diff>